<commit_message>
Rebuild v2026-08-20A governance DOCX to match recordable PDF layout
Re-created the 4 governance DOCX (Bylaws + Declaration, CLEAN + REDLINE)
with native Word furniture matching the recordable PDFs: county recording
cover sheet (CLEAN), 2-line running header + Return-to-Change-Index link,
3-zone footer (filename / DRAFT / Page X of Y), recordable-scope numbering,
and red-strikethrough / green-underline redline markup. Prior DOCX were
LibreOffice HTML->DOCX and lacked the page furniture.

Co-Authored-By: Claude Opus 4.8 <noreply@anthropic.com>
</commit_message>
<xml_diff>
--- a/governing-docs/02-legal-review/AHOA-Bylaws-CLEAN-Amended_v2026-08-20A.docx
+++ b/governing-docs/02-legal-review/AHOA-Bylaws-CLEAN-Amended_v2026-08-20A.docx
@@ -36,10 +36,9 @@
       </w:r>
     </w:p>
     <w:p>
+      <w:bookmarkStart w:id="90" w:name="ChangeIndex"/>
       <w:pPr>
         <w:pStyle w:val="Heading1"/>
-        <w:keepNext/>
-        <w:keepLines/>
         <w:bidi w:val="0"/>
         <w:rPr/>
       </w:pPr>
@@ -47,6 +46,7 @@
         <w:rPr/>
         <w:t>AHOA Bylaws — Proposed Changes</w:t>
       </w:r>
+      <w:bookmarkEnd w:id="90"/>
     </w:p>
     <w:p>
       <w:pPr>
@@ -62,8 +62,6 @@
     <w:p>
       <w:pPr>
         <w:pStyle w:val="Heading2"/>
-        <w:keepNext/>
-        <w:keepLines/>
         <w:bidi w:val="0"/>
         <w:jc w:val="left"/>
         <w:rPr/>
@@ -113,8 +111,6 @@
     <w:p>
       <w:pPr>
         <w:pStyle w:val="Heading2"/>
-        <w:keepNext/>
-        <w:keepLines/>
         <w:bidi w:val="0"/>
         <w:jc w:val="left"/>
         <w:rPr/>
@@ -164,8 +160,6 @@
     <w:p>
       <w:pPr>
         <w:pStyle w:val="Heading2"/>
-        <w:keepNext/>
-        <w:keepLines/>
         <w:bidi w:val="0"/>
         <w:jc w:val="left"/>
         <w:rPr/>
@@ -215,8 +209,6 @@
     <w:p>
       <w:pPr>
         <w:pStyle w:val="Heading2"/>
-        <w:keepNext/>
-        <w:keepLines/>
         <w:bidi w:val="0"/>
         <w:jc w:val="left"/>
         <w:rPr/>
@@ -266,8 +258,6 @@
     <w:p>
       <w:pPr>
         <w:pStyle w:val="Heading2"/>
-        <w:keepNext/>
-        <w:keepLines/>
         <w:bidi w:val="0"/>
         <w:jc w:val="left"/>
         <w:rPr/>
@@ -462,8 +452,6 @@
     <w:p>
       <w:pPr>
         <w:pStyle w:val="Heading2"/>
-        <w:keepNext/>
-        <w:keepLines/>
         <w:bidi w:val="0"/>
         <w:jc w:val="left"/>
         <w:rPr/>
@@ -513,8 +501,6 @@
     <w:p>
       <w:pPr>
         <w:pStyle w:val="Heading2"/>
-        <w:keepNext/>
-        <w:keepLines/>
         <w:bidi w:val="0"/>
         <w:jc w:val="left"/>
         <w:rPr/>
@@ -564,8 +550,6 @@
     <w:p>
       <w:pPr>
         <w:pStyle w:val="Heading2"/>
-        <w:keepNext/>
-        <w:keepLines/>
         <w:bidi w:val="0"/>
         <w:jc w:val="left"/>
         <w:rPr/>
@@ -673,8 +657,6 @@
     <w:p>
       <w:pPr>
         <w:pStyle w:val="Heading2"/>
-        <w:keepNext/>
-        <w:keepLines/>
         <w:bidi w:val="0"/>
         <w:jc w:val="left"/>
         <w:rPr/>
@@ -724,8 +706,6 @@
     <w:p>
       <w:pPr>
         <w:pStyle w:val="Heading2"/>
-        <w:keepNext/>
-        <w:keepLines/>
         <w:bidi w:val="0"/>
         <w:jc w:val="left"/>
         <w:rPr/>
@@ -741,6 +721,20 @@
         <w:bidi w:val="0"/>
         <w:ind w:hanging="0" w:left="80" w:right="80"/>
         <w:rPr/>
+        <w:sectPr>
+          <w:headerReference w:type="default" r:id="rId10"/>
+          <w:headerReference w:type="first" r:id="rId11"/>
+          <w:footerReference w:type="default" r:id="rId12"/>
+          <w:footerReference w:type="first" r:id="rId13"/>
+          <w:type w:val="nextPage"/>
+          <w:pgSz w:w="11906" w:h="16838"/>
+          <w:pgMar w:left="1440" w:right="1440" w:gutter="0" w:header="0" w:top="1440" w:footer="0" w:bottom="1440"/>
+          <w:pgNumType w:fmt="decimal"/>
+          <w:formProt w:val="false"/>
+          <w:titlePg/>
+          <w:textDirection w:val="lrTb"/>
+          <w:docGrid w:type="default" w:linePitch="600" w:charSpace="36864"/>
+        </w:sectPr>
       </w:pPr>
       <w:hyperlink w:anchor="chg-BY-19">
         <w:r>
@@ -803,9 +797,59 @@
     </w:p>
     <w:p>
       <w:pPr>
+        <w:jc w:val="center"/>
+        <w:sectPr>
+          <w:headerReference w:type="default" r:id="rId6"/>
+          <w:headerReference w:type="first" r:id="rId7"/>
+          <w:footerReference w:type="default" r:id="rId8"/>
+          <w:footerReference w:type="first" r:id="rId9"/>
+          <w:type w:val="nextPage"/>
+          <w:pgSz w:w="11906" w:h="16838"/>
+          <w:pgMar w:left="1440" w:right="1440" w:gutter="0" w:header="0" w:top="1440" w:footer="0" w:bottom="1440"/>
+          <w:pgNumType w:fmt="decimal"/>
+          <w:formProt w:val="false"/>
+          <w:textDirection w:val="lrTb"/>
+          <w:docGrid w:type="default" w:linePitch="600" w:charSpace="36864"/>
+        </w:sectPr>
+      </w:pPr>
+      <w:r>
+        <w:drawing>
+          <wp:inline xmlns:a="http://schemas.openxmlformats.org/drawingml/2006/main">
+            <wp:extent cx="6858000" cy="8875059"/>
+            <wp:docPr id="1" name="Picture 1"/>
+            <wp:cNvGraphicFramePr>
+              <a:graphicFrameLocks noChangeAspect="1"/>
+            </wp:cNvGraphicFramePr>
+            <a:graphic>
+              <a:graphicData uri="http://schemas.openxmlformats.org/drawingml/2006/picture">
+                <pic:pic>
+                  <pic:nvPicPr>
+                    <pic:cNvPr id="0" name="AHOA-Bylaws-CLEAN-Amended_v2026-08-20A_cover.png"/>
+                    <pic:cNvPicPr/>
+                  </pic:nvPicPr>
+                  <pic:blipFill>
+                    <a:blip r:embed="rId5"/>
+                    <a:stretch>
+                      <a:fillRect/>
+                    </a:stretch>
+                  </pic:blipFill>
+                  <pic:spPr>
+                    <a:xfrm>
+                      <a:off x="0" y="0"/>
+                      <a:ext cx="6858000" cy="8875059"/>
+                    </a:xfrm>
+                    <a:prstGeom prst="rect"/>
+                  </pic:spPr>
+                </pic:pic>
+              </a:graphicData>
+            </a:graphic>
+          </wp:inline>
+        </w:drawing>
+      </w:r>
+    </w:p>
+    <w:p>
+      <w:pPr>
         <w:pStyle w:val="Heading1"/>
-        <w:keepNext/>
-        <w:keepLines/>
         <w:bidi w:val="0"/>
         <w:rPr/>
       </w:pPr>
@@ -817,8 +861,6 @@
     <w:p>
       <w:pPr>
         <w:pStyle w:val="Heading1"/>
-        <w:keepNext/>
-        <w:keepLines/>
         <w:bidi w:val="0"/>
         <w:rPr/>
       </w:pPr>
@@ -841,8 +883,6 @@
     <w:p>
       <w:pPr>
         <w:pStyle w:val="Heading2"/>
-        <w:keepNext/>
-        <w:keepLines/>
         <w:bidi w:val="0"/>
         <w:jc w:val="left"/>
         <w:rPr/>
@@ -877,8 +917,6 @@
     <w:p>
       <w:pPr>
         <w:pStyle w:val="Heading3"/>
-        <w:keepNext/>
-        <w:keepLines/>
         <w:bidi w:val="0"/>
         <w:jc w:val="left"/>
         <w:rPr/>
@@ -913,8 +951,6 @@
     <w:p>
       <w:pPr>
         <w:pStyle w:val="Heading2"/>
-        <w:keepNext/>
-        <w:keepLines/>
         <w:bidi w:val="0"/>
         <w:jc w:val="left"/>
         <w:rPr/>
@@ -927,8 +963,6 @@
     <w:p>
       <w:pPr>
         <w:pStyle w:val="Heading3"/>
-        <w:keepNext/>
-        <w:keepLines/>
         <w:bidi w:val="0"/>
         <w:jc w:val="left"/>
         <w:rPr/>
@@ -993,7 +1027,7 @@
       <w:pPr>
         <w:pStyle w:val="BodyTextsection-hl"/>
         <w:bidi w:val="0"/>
-        <w:ind w:hanging="0" w:left="80" w:right="80"/>
+        <w:ind w:hanging="0" w:left="120" w:right="120"/>
         <w:rPr/>
       </w:pPr>
       <w:r>
@@ -1019,7 +1053,31 @@
       </w:r>
       <w:r>
         <w:rPr/>
-        <w:t xml:space="preserve"> "Unit" means one of the tax lots designated 2804, 2805, 2806, 2807, 2809, 2810, and 2812, and the improvements thereon.</w:t>
+        <w:t xml:space="preserve"> "Unit" means one of the tax </w:t>
+      </w:r>
+      <w:r>
+        <w:rPr>
+          <w:b/>
+          <w:color w:val="0A7A2C"/>
+          <w:u w:val="single"/>
+        </w:rPr>
+        <w:t>lots</w:t>
+      </w:r>
+      <w:r>
+        <w:rPr/>
+        <w:t xml:space="preserve"> designated 2804, 2805, 2806, 2807, </w:t>
+      </w:r>
+      <w:r>
+        <w:rPr>
+          <w:b/>
+          <w:color w:val="0A7A2C"/>
+          <w:u w:val="single"/>
+        </w:rPr>
+        <w:t>2809,</w:t>
+      </w:r>
+      <w:r>
+        <w:rPr/>
+        <w:t xml:space="preserve"> 2810, and 2812, and the improvements thereon.</w:t>
       </w:r>
     </w:p>
     <w:p>
@@ -1093,8 +1151,6 @@
     <w:p>
       <w:pPr>
         <w:pStyle w:val="Heading2"/>
-        <w:keepNext/>
-        <w:keepLines/>
         <w:bidi w:val="0"/>
         <w:jc w:val="left"/>
         <w:rPr/>
@@ -1107,8 +1163,6 @@
     <w:p>
       <w:pPr>
         <w:pStyle w:val="Heading3"/>
-        <w:keepNext/>
-        <w:keepLines/>
         <w:bidi w:val="0"/>
         <w:jc w:val="left"/>
         <w:rPr/>
@@ -1156,7 +1210,7 @@
       <w:pPr>
         <w:pStyle w:val="BodyTextsection-hl"/>
         <w:bidi w:val="0"/>
-        <w:ind w:hanging="0" w:left="80" w:right="80"/>
+        <w:ind w:hanging="0" w:left="120" w:right="120"/>
         <w:rPr/>
       </w:pPr>
       <w:r>
@@ -1182,7 +1236,79 @@
       </w:r>
       <w:r>
         <w:rPr/>
-        <w:t xml:space="preserve"> Notice of each meeting of the members shall be given by, or at the direction of, the secretary or person authorized to call the meeting, by acceptable method of notice, as required by ORS 94.650, as amended (currently not less than 10 nor more than 50 days before the meeting), to each member entitled to vote thereat. Such notice shall specify the place, day and hour of the meeting, and, in the case of special meeting, the purpose of the meeting.</w:t>
+        <w:t xml:space="preserve"> Notice of each meeting of the members shall be given by, or at the direction of, the secretary or person authorized to call the meeting, by acceptable method of notice, </w:t>
+      </w:r>
+      <w:r>
+        <w:rPr>
+          <w:b/>
+          <w:color w:val="0A7A2C"/>
+          <w:u w:val="single"/>
+        </w:rPr>
+        <w:t xml:space="preserve">as required by ORS 94.650, as amended (currently </w:t>
+      </w:r>
+      <w:r>
+        <w:rPr/>
+        <w:t xml:space="preserve">not less than </w:t>
+      </w:r>
+      <w:r>
+        <w:rPr>
+          <w:b/>
+          <w:color w:val="0A7A2C"/>
+          <w:u w:val="single"/>
+        </w:rPr>
+        <w:t>10</w:t>
+      </w:r>
+      <w:r>
+        <w:rPr/>
+        <w:t xml:space="preserve"> </w:t>
+      </w:r>
+      <w:r>
+        <w:rPr>
+          <w:b/>
+          <w:color w:val="0A7A2C"/>
+          <w:u w:val="single"/>
+        </w:rPr>
+        <w:t>nor</w:t>
+      </w:r>
+      <w:r>
+        <w:rPr/>
+        <w:t xml:space="preserve"> more than </w:t>
+      </w:r>
+      <w:r>
+        <w:rPr>
+          <w:b/>
+          <w:color w:val="0A7A2C"/>
+          <w:u w:val="single"/>
+        </w:rPr>
+        <w:t>50</w:t>
+      </w:r>
+      <w:r>
+        <w:rPr/>
+        <w:t xml:space="preserve"> days before </w:t>
+      </w:r>
+      <w:r>
+        <w:rPr>
+          <w:b/>
+          <w:color w:val="0A7A2C"/>
+          <w:u w:val="single"/>
+        </w:rPr>
+        <w:t>the</w:t>
+      </w:r>
+      <w:r>
+        <w:rPr/>
+        <w:t xml:space="preserve"> </w:t>
+      </w:r>
+      <w:r>
+        <w:rPr>
+          <w:b/>
+          <w:color w:val="0A7A2C"/>
+          <w:u w:val="single"/>
+        </w:rPr>
+        <w:t>meeting),</w:t>
+      </w:r>
+      <w:r>
+        <w:rPr/>
+        <w:t xml:space="preserve"> to each member entitled to vote thereat. Such notice shall specify the place, day and hour of the meeting, and, in the case of special meeting, the purpose of the meeting.</w:t>
       </w:r>
     </w:p>
     <w:p>
@@ -1267,8 +1393,6 @@
     <w:p>
       <w:pPr>
         <w:pStyle w:val="Heading2"/>
-        <w:keepNext/>
-        <w:keepLines/>
         <w:bidi w:val="0"/>
         <w:jc w:val="left"/>
         <w:rPr/>
@@ -1281,8 +1405,6 @@
     <w:p>
       <w:pPr>
         <w:pStyle w:val="Heading3"/>
-        <w:keepNext/>
-        <w:keepLines/>
         <w:bidi w:val="0"/>
         <w:jc w:val="left"/>
         <w:rPr/>
@@ -1296,7 +1418,7 @@
       <w:pPr>
         <w:pStyle w:val="BodyTextsection-hl"/>
         <w:bidi w:val="0"/>
-        <w:ind w:hanging="0" w:left="80" w:right="80"/>
+        <w:ind w:hanging="0" w:left="120" w:right="120"/>
         <w:rPr/>
       </w:pPr>
       <w:r>
@@ -1322,7 +1444,46 @@
       </w:r>
       <w:r>
         <w:rPr/>
-        <w:t xml:space="preserve"> The affairs of this Association shall be managed by a Board of Directors consisting of not less than three (3) nor more than five (5) Directors. The exact number of Directors within that range shall be fixed from time to time by the members at the annual meeting; until so fixed, the number of Directors shall be three (3).</w:t>
+        <w:t xml:space="preserve"> The affairs of this Association shall be managed by a Board of </w:t>
+      </w:r>
+      <w:r>
+        <w:rPr>
+          <w:b/>
+          <w:color w:val="0A7A2C"/>
+          <w:u w:val="single"/>
+        </w:rPr>
+        <w:t xml:space="preserve">Directors consisting of not less than </w:t>
+      </w:r>
+      <w:r>
+        <w:rPr/>
+        <w:t xml:space="preserve">three </w:t>
+      </w:r>
+      <w:r>
+        <w:rPr>
+          <w:b/>
+          <w:color w:val="0A7A2C"/>
+          <w:u w:val="single"/>
+        </w:rPr>
+        <w:t xml:space="preserve">(3) nor more than five (5) </w:t>
+      </w:r>
+      <w:r>
+        <w:rPr/>
+        <w:t>Directors.</w:t>
+      </w:r>
+      <w:r>
+        <w:rPr>
+          <w:color w:val="0A7A2C"/>
+          <w:u w:val="single"/>
+        </w:rPr>
+        <w:t xml:space="preserve"> </w:t>
+      </w:r>
+      <w:r>
+        <w:rPr>
+          <w:b/>
+          <w:color w:val="0A7A2C"/>
+          <w:u w:val="single"/>
+        </w:rPr>
+        <w:t>The exact number of Directors within that range shall be fixed from time to time by the members at the annual meeting; until so fixed, the number of Directors shall be three (3).</w:t>
       </w:r>
     </w:p>
     <w:p>
@@ -1396,8 +1557,6 @@
     <w:p>
       <w:pPr>
         <w:pStyle w:val="Heading2"/>
-        <w:keepNext/>
-        <w:keepLines/>
         <w:bidi w:val="0"/>
         <w:jc w:val="left"/>
         <w:rPr/>
@@ -1410,8 +1569,6 @@
     <w:p>
       <w:pPr>
         <w:pStyle w:val="Heading3"/>
-        <w:keepNext/>
-        <w:keepLines/>
         <w:bidi w:val="0"/>
         <w:jc w:val="left"/>
         <w:rPr/>
@@ -1458,8 +1615,6 @@
     <w:p>
       <w:pPr>
         <w:pStyle w:val="Heading2"/>
-        <w:keepNext/>
-        <w:keepLines/>
         <w:bidi w:val="0"/>
         <w:jc w:val="left"/>
         <w:rPr/>
@@ -1472,8 +1627,6 @@
     <w:p>
       <w:pPr>
         <w:pStyle w:val="Heading3"/>
-        <w:keepNext/>
-        <w:keepLines/>
         <w:bidi w:val="0"/>
         <w:jc w:val="left"/>
         <w:rPr/>
@@ -1521,14 +1674,23 @@
       <w:pPr>
         <w:pStyle w:val="BodyTextsection-hl"/>
         <w:bidi w:val="0"/>
-        <w:ind w:hanging="0" w:left="80" w:right="80"/>
-        <w:rPr/>
-      </w:pPr>
-      <w:r>
-        <w:rPr>
-          <w:rStyle w:val="Strong"/>
-        </w:rPr>
-        <w:t>Section 3. Open Meetings; Notice; Executive Session.</w:t>
+        <w:ind w:hanging="0" w:left="120" w:right="120"/>
+        <w:rPr/>
+      </w:pPr>
+      <w:r>
+        <w:rPr>
+          <w:rStyle w:val="Strong"/>
+        </w:rPr>
+        <w:t xml:space="preserve">Section 3. </w:t>
+      </w:r>
+      <w:r>
+        <w:rPr>
+          <w:rStyle w:val="Strong"/>
+          <w:b/>
+          <w:color w:val="0A7A2C"/>
+          <w:u w:val="single"/>
+        </w:rPr>
+        <w:t>Open Meetings; Notice; Executive Session.</w:t>
       </w:r>
       <w:r>
         <w:rPr/>
@@ -1547,14 +1709,20 @@
       </w:r>
       <w:r>
         <w:rPr/>
-        <w:t xml:space="preserve"> All meetings of the Board of Directors are open to the owners. Owners shall be given advance notice of Board meetings as required by ORS 94.640, as amended (currently at least 3 days). The Board may meet in executive session only for matters permitted by ORS 94.640 and ORS 94.644, as amended, including but not limited to consultation with legal counsel; pending or threatened litigation; personnel matters; and the negotiation of, or collection of, delinquent assessments. The Board may enter executive session only by a vote taken in open session, and any decision required to be made shall be made in open session.</w:t>
+        <w:t xml:space="preserve"> </w:t>
+      </w:r>
+      <w:r>
+        <w:rPr>
+          <w:b/>
+          <w:color w:val="0A7A2C"/>
+          <w:u w:val="single"/>
+        </w:rPr>
+        <w:t>All meetings of the Board of Directors are open to the owners. Owners shall be given advance notice of Board meetings as required by ORS 94.640, as amended (currently at least 3 days). The Board may meet in executive session only for matters permitted by ORS 94.640 and ORS 94.644, as amended, including but not limited to consultation with legal counsel; pending or threatened litigation; personnel matters; and the negotiation of, or collection of, delinquent assessments. The Board may enter executive session only by a vote taken in open session, and any decision required to be made shall be made in open session.</w:t>
       </w:r>
     </w:p>
     <w:p>
       <w:pPr>
         <w:pStyle w:val="Heading2"/>
-        <w:keepNext/>
-        <w:keepLines/>
         <w:bidi w:val="0"/>
         <w:jc w:val="left"/>
         <w:rPr/>
@@ -1567,8 +1735,6 @@
     <w:p>
       <w:pPr>
         <w:pStyle w:val="Heading3"/>
-        <w:keepNext/>
-        <w:keepLines/>
         <w:bidi w:val="0"/>
         <w:jc w:val="left"/>
         <w:rPr/>
@@ -1632,7 +1798,7 @@
       <w:pPr>
         <w:pStyle w:val="BodyTextsection-hl"/>
         <w:bidi w:val="0"/>
-        <w:ind w:hanging="0" w:left="80" w:right="80"/>
+        <w:ind w:hanging="0" w:left="120" w:right="120"/>
         <w:rPr/>
       </w:pPr>
       <w:r>
@@ -1685,10 +1851,42 @@
         <w:t>(e) procure and maintain adequate liability and hazard insurance as provided in Article XII of the Bylaws;</w:t>
         <w:br/>
         <w:br/>
-        <w:t>(f) obtain and maintain fidelity and crime coverage as required by ORS 94.675, as amended, covering all persons who control or disburse, or otherwise have access to, Association funds, including but not limited to directors, officers, employees, and any managing agent, and including computer-fraud and funds-transfer fraud coverage. Such coverage shall be in an amount not less than that required by statute (currently an amount at least equal to the Association's funds plus the value of any securities held by the Association), subject to the statutory annual owner opt-out. The specific amount and terms shall be set by the Board by resolution;</w:t>
+        <w:t xml:space="preserve">(f) </w:t>
+      </w:r>
+      <w:r>
+        <w:rPr>
+          <w:b/>
+          <w:color w:val="0A7A2C"/>
+          <w:u w:val="single"/>
+        </w:rPr>
+        <w:t>obtain and maintain fidelity and crime coverage as required by ORS 94.675, as amended, covering all persons who control or disburse, or otherwise have access to, Association funds, including but not limited to directors, officers, employees, and any managing agent, and including computer-fraud and funds-transfer fraud coverage. Such coverage shall be in an amount not less than that required by statute (currently an amount at least equal to the Association's funds plus the value of any securities held by the Association), subject to the statutory annual owner opt-out. The specific amount and terms shall be set by the Board by resolution;</w:t>
         <w:br/>
         <w:br/>
-        <w:t>(g) cause the Common Property to be maintained as provided in Section 3 of this Article;</w:t>
+        <w:t xml:space="preserve">(g) </w:t>
+      </w:r>
+      <w:r>
+        <w:rPr/>
+        <w:t xml:space="preserve">cause </w:t>
+      </w:r>
+      <w:r>
+        <w:rPr>
+          <w:b/>
+          <w:color w:val="0A7A2C"/>
+          <w:u w:val="single"/>
+        </w:rPr>
+        <w:t>the Common Property</w:t>
+      </w:r>
+      <w:r>
+        <w:rPr/>
+        <w:t xml:space="preserve"> to be </w:t>
+      </w:r>
+      <w:r>
+        <w:rPr>
+          <w:b/>
+          <w:color w:val="0A7A2C"/>
+          <w:u w:val="single"/>
+        </w:rPr>
+        <w:t>maintained as provided in Section 3 of this Article;</w:t>
         <w:br/>
         <w:br/>
         <w:t>(h) open bank accounts on behalf of the Association and designate the signatories required therefor, and deposit and disburse Association funds as provided in Section 4 of this Article;</w:t>
@@ -1697,27 +1895,64 @@
         <w:t>(i) adopt, amend, and repeal administrative rules and regulations governing the operation and use of the Common Property as provided in Section 5 of this Article;</w:t>
         <w:br/>
         <w:br/>
-        <w:t>(j) adopt an annual budget and distribute it to the owners as provided in Section 6 of this Article;</w:t>
+        <w:t>(j) adopt an annual budget and distribute</w:t>
+      </w:r>
+      <w:r>
+        <w:rPr/>
+        <w:t xml:space="preserve"> it </w:t>
+      </w:r>
+      <w:r>
+        <w:rPr>
+          <w:b/>
+          <w:color w:val="0A7A2C"/>
+          <w:u w:val="single"/>
+        </w:rPr>
+        <w:t>to the owners</w:t>
+      </w:r>
+      <w:r>
+        <w:rPr/>
+        <w:t xml:space="preserve"> as provided in </w:t>
+      </w:r>
+      <w:r>
+        <w:rPr>
+          <w:b/>
+          <w:color w:val="0A7A2C"/>
+          <w:u w:val="single"/>
+        </w:rPr>
+        <w:t>Section 6 of this Article;</w:t>
         <w:br/>
         <w:br/>
         <w:t>(k) prepare and distribute an annual financial statement as provided in Section 7 of this Article;</w:t>
         <w:br/>
         <w:br/>
-        <w:t>(l) enforce the provisions of the Declaration and these Bylaws and rules and regulations adopted and published thereunder.</w:t>
+        <w:t>(l)</w:t>
+      </w:r>
+      <w:r>
+        <w:rPr/>
+        <w:t xml:space="preserve"> enforce the provisions of the Declaration and these Bylaws and rules and regulations adopted and published thereunder.</w:t>
       </w:r>
     </w:p>
     <w:p>
       <w:pPr>
         <w:pStyle w:val="BodyTextsection-hl"/>
         <w:bidi w:val="0"/>
-        <w:ind w:hanging="0" w:left="80" w:right="80"/>
-        <w:rPr/>
-      </w:pPr>
-      <w:r>
-        <w:rPr>
-          <w:rStyle w:val="Strong"/>
-        </w:rPr>
-        <w:t>Section 3. Common Property Maintenance Program.</w:t>
+        <w:ind w:hanging="0" w:left="120" w:right="120"/>
+        <w:rPr/>
+      </w:pPr>
+      <w:r>
+        <w:rPr>
+          <w:rStyle w:val="Strong"/>
+        </w:rPr>
+        <w:t xml:space="preserve">Section 3. </w:t>
+      </w:r>
+      <w:r>
+        <w:rPr>
+          <w:rStyle w:val="Strong"/>
+          <w:b/>
+          <w:color w:val="0A7A2C"/>
+          <w:u w:val="single"/>
+        </w:rPr>
+        <w:t>Common Property Maintenance Program.</w:t>
       </w:r>
       <w:r>
         <w:rPr/>
@@ -1736,21 +1971,38 @@
       </w:r>
       <w:r>
         <w:rPr/>
-        <w:t xml:space="preserve"> The Board shall establish and carry out a program for the maintenance, upkeep, repair, and replacement of the Common Property (Tax Lot 2801), as required by ORS 94.635(10), as amended. The cost of the program shall be paid from assessments as a common expense of the Association. Payment vouchers for the program shall be approved in the manner the Board establishes by resolution. This program covers the Common Property only; the maintenance, repair, and replacement of the structures and improvements upon the individual units are the responsibility of the respective owners as provided in the Declaration.</w:t>
+        <w:t xml:space="preserve"> </w:t>
+      </w:r>
+      <w:r>
+        <w:rPr>
+          <w:b/>
+          <w:color w:val="0A7A2C"/>
+          <w:u w:val="single"/>
+        </w:rPr>
+        <w:t>The Board shall establish and carry out a program for the maintenance, upkeep, repair, and replacement of the Common Property (Tax Lot 2801), as required by ORS 94.635(10), as amended. The cost of the program shall be paid from assessments as a common expense of the Association. Payment vouchers for the program shall be approved in the manner the Board establishes by resolution. This program covers the Common Property only; the maintenance, repair, and replacement of the structures and improvements upon the individual units are the responsibility of the respective owners as provided in the Declaration.</w:t>
       </w:r>
     </w:p>
     <w:p>
       <w:pPr>
         <w:pStyle w:val="BodyTextsection-hl"/>
         <w:bidi w:val="0"/>
-        <w:ind w:hanging="0" w:left="80" w:right="80"/>
-        <w:rPr/>
-      </w:pPr>
-      <w:r>
-        <w:rPr>
-          <w:rStyle w:val="Strong"/>
-        </w:rPr>
-        <w:t>Section 4. Association Account.</w:t>
+        <w:ind w:hanging="0" w:left="120" w:right="120"/>
+        <w:rPr/>
+      </w:pPr>
+      <w:r>
+        <w:rPr>
+          <w:rStyle w:val="Strong"/>
+        </w:rPr>
+        <w:t xml:space="preserve">Section 4. </w:t>
+      </w:r>
+      <w:r>
+        <w:rPr>
+          <w:rStyle w:val="Strong"/>
+          <w:b/>
+          <w:color w:val="0A7A2C"/>
+          <w:u w:val="single"/>
+        </w:rPr>
+        <w:t>Association Account.</w:t>
       </w:r>
       <w:r>
         <w:rPr/>
@@ -1769,21 +2021,38 @@
       </w:r>
       <w:r>
         <w:rPr/>
-        <w:t xml:space="preserve"> All assessments and other Association funds shall be deposited in a separate account maintained in the name of the Association at an Oregon-based federally insured financial institution, as required by ORS 94.670(2), as amended. All expenses of the Association shall be paid from that account.</w:t>
+        <w:t xml:space="preserve"> </w:t>
+      </w:r>
+      <w:r>
+        <w:rPr>
+          <w:b/>
+          <w:color w:val="0A7A2C"/>
+          <w:u w:val="single"/>
+        </w:rPr>
+        <w:t>All assessments and other Association funds shall be deposited in a separate account maintained in the name of the Association at an Oregon-based federally insured financial institution, as required by ORS 94.670(2), as amended. All expenses of the Association shall be paid from that account.</w:t>
       </w:r>
     </w:p>
     <w:p>
       <w:pPr>
         <w:pStyle w:val="BodyTextsection-hl"/>
         <w:bidi w:val="0"/>
-        <w:ind w:hanging="0" w:left="80" w:right="80"/>
-        <w:rPr/>
-      </w:pPr>
-      <w:r>
-        <w:rPr>
-          <w:rStyle w:val="Strong"/>
-        </w:rPr>
-        <w:t>Section 5. Administrative Rules and Regulations.</w:t>
+        <w:ind w:hanging="0" w:left="120" w:right="120"/>
+        <w:rPr/>
+      </w:pPr>
+      <w:r>
+        <w:rPr>
+          <w:rStyle w:val="Strong"/>
+        </w:rPr>
+        <w:t xml:space="preserve">Section 5. </w:t>
+      </w:r>
+      <w:r>
+        <w:rPr>
+          <w:rStyle w:val="Strong"/>
+          <w:b/>
+          <w:color w:val="0A7A2C"/>
+          <w:u w:val="single"/>
+        </w:rPr>
+        <w:t>Administrative Rules and Regulations.</w:t>
       </w:r>
       <w:r>
         <w:rPr/>
@@ -1802,21 +2071,38 @@
       </w:r>
       <w:r>
         <w:rPr/>
-        <w:t xml:space="preserve"> The Board may adopt, amend, and repeal administrative rules and regulations governing the operation and use of the Common Property, as provided in ORS 94.635(15), as amended. Rules shall be adopted or amended by resolution at an open meeting of the Board, with notice to the owners and a stated effective date.</w:t>
+        <w:t xml:space="preserve"> </w:t>
+      </w:r>
+      <w:r>
+        <w:rPr>
+          <w:b/>
+          <w:color w:val="0A7A2C"/>
+          <w:u w:val="single"/>
+        </w:rPr>
+        <w:t>The Board may adopt, amend, and repeal administrative rules and regulations governing the operation and use of the Common Property, as provided in ORS 94.635(15), as amended. Rules shall be adopted or amended by resolution at an open meeting of the Board, with notice to the owners and a stated effective date.</w:t>
       </w:r>
     </w:p>
     <w:p>
       <w:pPr>
         <w:pStyle w:val="BodyTextsection-hl"/>
         <w:bidi w:val="0"/>
-        <w:ind w:hanging="0" w:left="80" w:right="80"/>
-        <w:rPr/>
-      </w:pPr>
-      <w:r>
-        <w:rPr>
-          <w:rStyle w:val="Strong"/>
-        </w:rPr>
-        <w:t>Section 6. Annual Budget.</w:t>
+        <w:ind w:hanging="0" w:left="120" w:right="120"/>
+        <w:rPr/>
+      </w:pPr>
+      <w:r>
+        <w:rPr>
+          <w:rStyle w:val="Strong"/>
+        </w:rPr>
+        <w:t xml:space="preserve">Section 6. </w:t>
+      </w:r>
+      <w:r>
+        <w:rPr>
+          <w:rStyle w:val="Strong"/>
+          <w:b/>
+          <w:color w:val="0A7A2C"/>
+          <w:u w:val="single"/>
+        </w:rPr>
+        <w:t>Annual Budget.</w:t>
       </w:r>
       <w:r>
         <w:rPr/>
@@ -1835,21 +2121,38 @@
       </w:r>
       <w:r>
         <w:rPr/>
-        <w:t xml:space="preserve"> The Board shall adopt an annual budget and distribute a summary of it to all owners as required by ORS 94.645, as amended (currently within 30 days after adoption). If the Board does not adopt a budget for any fiscal year, the last budget adopted shall continue in effect until a new budget is adopted.</w:t>
+        <w:t xml:space="preserve"> </w:t>
+      </w:r>
+      <w:r>
+        <w:rPr>
+          <w:b/>
+          <w:color w:val="0A7A2C"/>
+          <w:u w:val="single"/>
+        </w:rPr>
+        <w:t>The Board shall adopt an annual budget and distribute a summary of it to all owners as required by ORS 94.645, as amended (currently within 30 days after adoption). If the Board does not adopt a budget for any fiscal year, the last budget adopted shall continue in effect until a new budget is adopted.</w:t>
       </w:r>
     </w:p>
     <w:p>
       <w:pPr>
         <w:pStyle w:val="BodyTextsection-hl"/>
         <w:bidi w:val="0"/>
-        <w:ind w:hanging="0" w:left="80" w:right="80"/>
-        <w:rPr/>
-      </w:pPr>
-      <w:r>
-        <w:rPr>
-          <w:rStyle w:val="Strong"/>
-        </w:rPr>
-        <w:t>Section 7. Annual Financial Statement.</w:t>
+        <w:ind w:hanging="0" w:left="120" w:right="120"/>
+        <w:rPr/>
+      </w:pPr>
+      <w:r>
+        <w:rPr>
+          <w:rStyle w:val="Strong"/>
+        </w:rPr>
+        <w:t xml:space="preserve">Section 7. </w:t>
+      </w:r>
+      <w:r>
+        <w:rPr>
+          <w:rStyle w:val="Strong"/>
+          <w:b/>
+          <w:color w:val="0A7A2C"/>
+          <w:u w:val="single"/>
+        </w:rPr>
+        <w:t>Annual Financial Statement.</w:t>
       </w:r>
       <w:r>
         <w:rPr/>
@@ -1868,14 +2171,20 @@
       </w:r>
       <w:r>
         <w:rPr/>
-        <w:t xml:space="preserve"> The Board shall prepare and distribute to each owner, and to any mortgagee that requests it in writing, an annual financial statement, including a balance sheet and an income and expense statement, as required by ORS 94.670, as amended (currently within 90 days after the end of the fiscal year).</w:t>
+        <w:t xml:space="preserve"> </w:t>
+      </w:r>
+      <w:r>
+        <w:rPr>
+          <w:b/>
+          <w:color w:val="0A7A2C"/>
+          <w:u w:val="single"/>
+        </w:rPr>
+        <w:t>The Board shall prepare and distribute to each owner, and to any mortgagee that requests it in writing, an annual financial statement, including a balance sheet and an income and expense statement, as required by ORS 94.670, as amended (currently within 90 days after the end of the fiscal year).</w:t>
       </w:r>
     </w:p>
     <w:p>
       <w:pPr>
         <w:pStyle w:val="Heading2"/>
-        <w:keepNext/>
-        <w:keepLines/>
         <w:bidi w:val="0"/>
         <w:jc w:val="left"/>
         <w:rPr/>
@@ -1888,8 +2197,6 @@
     <w:p>
       <w:pPr>
         <w:pStyle w:val="Heading3"/>
-        <w:keepNext/>
-        <w:keepLines/>
         <w:bidi w:val="0"/>
         <w:jc w:val="left"/>
         <w:rPr/>
@@ -2022,7 +2329,7 @@
       <w:pPr>
         <w:pStyle w:val="BodyTextsection-hl"/>
         <w:bidi w:val="0"/>
-        <w:ind w:hanging="0" w:left="80" w:right="80"/>
+        <w:ind w:hanging="0" w:left="120" w:right="120"/>
         <w:rPr/>
       </w:pPr>
       <w:r>
@@ -2057,14 +2364,60 @@
         <w:t>(b) Secretary. The secretary shall record the votes and keep the minutes of all meetings and proceedings of the Board and of the members; serve notice of meetings of the Board and of the members; keep appropriate current records showing the members of the Association together with their addresses and shall perform such other duties as required by the Board.</w:t>
         <w:br/>
         <w:br/>
-        <w:t>(c) Treasurer. The treasurer shall receive and deposit in the Association account all monies of the Association and shall disburse such funds as directed by resolution of the Board of Directors; shall sign all checks and promissory notes of the Association; shall keep proper books of account; shall maintain the Association's books and records and ensure the preparation of the annual financial statement and of any independent certified public accountant review required by ORS 94.670, as amended (currently a CPA review is required only if the Association's annual assessments exceed $75,000); and shall prepare an annual budget and a statement of income and expenditures to be presented to the membership at its regular annual meeting, and deliver a copy of each to the members.</w:t>
+        <w:t xml:space="preserve">(c) Treasurer. The treasurer shall receive and deposit in </w:t>
+      </w:r>
+      <w:r>
+        <w:rPr>
+          <w:b/>
+          <w:color w:val="0A7A2C"/>
+          <w:u w:val="single"/>
+        </w:rPr>
+        <w:t>the Association account</w:t>
+      </w:r>
+      <w:r>
+        <w:rPr/>
+        <w:t xml:space="preserve"> all monies of the Association and shall disburse such funds as directed by resolution of the Board of Directors; shall sign all checks and promissory notes of the Association; shall keep proper books of account; shall </w:t>
+      </w:r>
+      <w:r>
+        <w:rPr>
+          <w:b/>
+          <w:color w:val="0A7A2C"/>
+          <w:u w:val="single"/>
+        </w:rPr>
+        <w:t>maintain the Association's books and records and ensure the preparation of the annual financial statement and of any independent certified public accountant review required by ORS 94.670, as amended (currently a CPA review is required only if the Association's annual assessments exceed $75,000); and shall prepare an annual budget and a statement of income and expenditures to be presented to the membership</w:t>
+      </w:r>
+      <w:r>
+        <w:rPr/>
+        <w:t xml:space="preserve"> at </w:t>
+      </w:r>
+      <w:r>
+        <w:rPr>
+          <w:b/>
+          <w:color w:val="0A7A2C"/>
+          <w:u w:val="single"/>
+        </w:rPr>
+        <w:t>its regular annual meeting, and deliver</w:t>
+      </w:r>
+      <w:r>
+        <w:rPr/>
+        <w:t xml:space="preserve"> a </w:t>
+      </w:r>
+      <w:r>
+        <w:rPr>
+          <w:b/>
+          <w:color w:val="0A7A2C"/>
+          <w:u w:val="single"/>
+        </w:rPr>
+        <w:t>copy of each</w:t>
+      </w:r>
+      <w:r>
+        <w:rPr/>
+        <w:t xml:space="preserve"> to the members.</w:t>
       </w:r>
     </w:p>
     <w:p>
       <w:pPr>
         <w:pStyle w:val="Heading2"/>
-        <w:keepNext/>
-        <w:keepLines/>
         <w:bidi w:val="0"/>
         <w:jc w:val="left"/>
         <w:rPr/>
@@ -2077,8 +2430,6 @@
     <w:p>
       <w:pPr>
         <w:pStyle w:val="Heading3"/>
-        <w:keepNext/>
-        <w:keepLines/>
         <w:bidi w:val="0"/>
         <w:jc w:val="left"/>
         <w:rPr/>
@@ -2102,8 +2453,6 @@
     <w:p>
       <w:pPr>
         <w:pStyle w:val="Heading2"/>
-        <w:keepNext/>
-        <w:keepLines/>
         <w:bidi w:val="0"/>
         <w:jc w:val="left"/>
         <w:rPr/>
@@ -2116,8 +2465,6 @@
     <w:p>
       <w:pPr>
         <w:pStyle w:val="Heading3"/>
-        <w:keepNext/>
-        <w:keepLines/>
         <w:bidi w:val="0"/>
         <w:jc w:val="left"/>
         <w:rPr/>
@@ -2148,7 +2495,7 @@
       <w:pPr>
         <w:pStyle w:val="BodyTextsection-hl"/>
         <w:bidi w:val="0"/>
-        <w:ind w:hanging="0" w:left="80" w:right="80"/>
+        <w:ind w:hanging="0" w:left="120" w:right="120"/>
         <w:rPr/>
       </w:pPr>
       <w:r>
@@ -2174,7 +2521,43 @@
       </w:r>
       <w:r>
         <w:rPr/>
-        <w:t xml:space="preserve"> The books, records and documents of the Association shall be available during reasonable times for inspection by owners or by holders, insurers, and/or guarantors of a first mortgage securing a unit. Upon written request, the records of the Association shall be made available for duplication, and copies shall be furnished, as required by ORS 94.670, as amended (currently within 10 business days after the request); the Board may charge a reasonable fee for furnishing copies to an owner, mortgagee, or prospective purchaser.</w:t>
+        <w:t xml:space="preserve"> The books, records and documents of the Association shall be available during reasonable times for inspection by owners or by holders, insurers, and/or guarantors of a first mortgage securing a unit. </w:t>
+      </w:r>
+      <w:r>
+        <w:rPr>
+          <w:b/>
+          <w:color w:val="0A7A2C"/>
+          <w:u w:val="single"/>
+        </w:rPr>
+        <w:t>Upon</w:t>
+      </w:r>
+      <w:r>
+        <w:rPr/>
+        <w:t xml:space="preserve"> </w:t>
+      </w:r>
+      <w:r>
+        <w:rPr>
+          <w:b/>
+          <w:color w:val="0A7A2C"/>
+          <w:u w:val="single"/>
+        </w:rPr>
+        <w:t>written request, the records</w:t>
+      </w:r>
+      <w:r>
+        <w:rPr/>
+        <w:t xml:space="preserve"> of </w:t>
+      </w:r>
+      <w:r>
+        <w:rPr>
+          <w:b/>
+          <w:color w:val="0A7A2C"/>
+          <w:u w:val="single"/>
+        </w:rPr>
+        <w:t>the Association shall be made available for duplication, and copies shall be furnished, as required by ORS 94.670, as amended (currently within 10 business days after the request); the Board</w:t>
+      </w:r>
+      <w:r>
+        <w:rPr/>
+        <w:t xml:space="preserve"> may charge a reasonable fee for furnishing copies to an owner, mortgagee, or prospective purchaser.</w:t>
       </w:r>
     </w:p>
     <w:p>
@@ -2197,8 +2580,6 @@
     <w:p>
       <w:pPr>
         <w:pStyle w:val="Heading2"/>
-        <w:keepNext/>
-        <w:keepLines/>
         <w:bidi w:val="0"/>
         <w:jc w:val="left"/>
         <w:rPr/>
@@ -2211,8 +2592,6 @@
     <w:p>
       <w:pPr>
         <w:pStyle w:val="Heading3"/>
-        <w:keepNext/>
-        <w:keepLines/>
         <w:bidi w:val="0"/>
         <w:jc w:val="left"/>
         <w:rPr/>
@@ -2236,8 +2615,6 @@
     <w:p>
       <w:pPr>
         <w:pStyle w:val="Heading2"/>
-        <w:keepNext/>
-        <w:keepLines/>
         <w:bidi w:val="0"/>
         <w:jc w:val="left"/>
         <w:rPr/>
@@ -2250,8 +2627,6 @@
     <w:p>
       <w:pPr>
         <w:pStyle w:val="Heading3"/>
-        <w:keepNext/>
-        <w:keepLines/>
         <w:bidi w:val="0"/>
         <w:jc w:val="left"/>
         <w:rPr/>
@@ -2265,14 +2640,23 @@
       <w:pPr>
         <w:pStyle w:val="BodyTextsection-hl"/>
         <w:bidi w:val="0"/>
-        <w:ind w:hanging="0" w:left="80" w:right="80"/>
-        <w:rPr/>
-      </w:pPr>
-      <w:r>
-        <w:rPr>
-          <w:rStyle w:val="Strong"/>
-        </w:rPr>
-        <w:t>Section 1. Insurance ("Master Policy").</w:t>
+        <w:ind w:hanging="0" w:left="120" w:right="120"/>
+        <w:rPr/>
+      </w:pPr>
+      <w:r>
+        <w:rPr>
+          <w:rStyle w:val="Strong"/>
+        </w:rPr>
+        <w:t xml:space="preserve">Section 1. </w:t>
+      </w:r>
+      <w:r>
+        <w:rPr>
+          <w:rStyle w:val="Strong"/>
+          <w:b/>
+          <w:color w:val="0A7A2C"/>
+          <w:u w:val="single"/>
+        </w:rPr>
+        <w:t>Insurance ("Master Policy").</w:t>
       </w:r>
       <w:r>
         <w:rPr/>
@@ -2291,7 +2675,15 @@
       </w:r>
       <w:r>
         <w:rPr/>
-        <w:t xml:space="preserve"> For the benefit of the Association and the owners, the Board of Directors shall secure and maintain the following insurance coverage and shall pay for the same as a common expense of the Association:</w:t>
+        <w:t xml:space="preserve"> </w:t>
+      </w:r>
+      <w:r>
+        <w:rPr>
+          <w:b/>
+          <w:color w:val="0A7A2C"/>
+          <w:u w:val="single"/>
+        </w:rPr>
+        <w:t>For the benefit of the Association and the owners, the Board of Directors shall secure and maintain the following insurance coverage and shall pay for the same as a common expense of the Association:</w:t>
         <w:br/>
         <w:br/>
         <w:t>(a) Property Coverage (Base-Standard Basis). A policy or policies of property insurance covering each structure on a base-standard basis. The coverage shall insure each structure to the original building standard (the "Standard Unit," as defined in the Declaration, Article I, Section 9, the specifics of which the Board establishes and maintains by resolution) at full replacement cost (i.e., 100 percent of current replacement cost) of the Standard Unit, exclusive of land, foundation, excavation and other items normally excluded from coverage. The coverage does not extend to improvements or betterments above the Standard Unit, which each owner must insure as provided in Section 4 of this Article and in ORS 94.685, as amended. The insurance policy or policies must protect against loss or damage by fire and all other hazards that are normally covered by the standard extended coverage endorsement as well as those covered by the standard "all risks" endorsement. If at all possible, the policy will also contain an "agreed amount and inflation guard" endorsement. Such policy or policies shall name the Association and the individual owners as insureds and shall provide for a separate loss payable in favor of all mortgagees. The policy or policies shall provide for a deductible in an amount the Board sets by resolution, consistent with ORS 94.675, as amended. As provided in ORS 94.675(3), as amended, the amount of any deductible shall be added to the face amount of the policy in determining whether the insurance equals full replacement cost.</w:t>
@@ -2341,14 +2733,23 @@
       <w:pPr>
         <w:pStyle w:val="BodyTextsection-hl"/>
         <w:bidi w:val="0"/>
-        <w:ind w:hanging="0" w:left="80" w:right="80"/>
-        <w:rPr/>
-      </w:pPr>
-      <w:r>
-        <w:rPr>
-          <w:rStyle w:val="Strong"/>
-        </w:rPr>
-        <w:t>Section 4. Owners' Obligations.</w:t>
+        <w:ind w:hanging="0" w:left="120" w:right="120"/>
+        <w:rPr/>
+      </w:pPr>
+      <w:r>
+        <w:rPr>
+          <w:rStyle w:val="Strong"/>
+        </w:rPr>
+        <w:t xml:space="preserve">Section 4. </w:t>
+      </w:r>
+      <w:r>
+        <w:rPr>
+          <w:rStyle w:val="Strong"/>
+          <w:b/>
+          <w:color w:val="0A7A2C"/>
+          <w:u w:val="single"/>
+        </w:rPr>
+        <w:t>Owners' Obligations.</w:t>
       </w:r>
       <w:r>
         <w:rPr/>
@@ -2367,7 +2768,15 @@
       </w:r>
       <w:r>
         <w:rPr/>
-        <w:t xml:space="preserve"> Each owner shall be responsible for obtaining, at their own expense, insurance covering their property not insured under Section 1. In satisfaction of ORS 94.685, as amended, each owner shall obtain and maintain insurance covering, including but not limited to, the improvements and betterments to the owner's unit above the Standard Unit (as defined in the Declaration, Article I, Section 9) and the owner's responsibility for the deductible under the Association's master policy. Such owner coverage shall exclude any coverage that the owner is precluded from obtaining so as to avoid duplicate coverage. As between the Association's master policy and an owner's policy, the master policy shall be primary as to the Standard Unit and the owner's policy shall be primary as to the owner's improvements, betterments, and master-policy deductible responsibility, so that there is neither a gap nor an overlap in coverage. Each owner shall promptly inform the Board of any loss, claim or damage which may be covered under a policy maintained by the Association.</w:t>
+        <w:t xml:space="preserve"> </w:t>
+      </w:r>
+      <w:r>
+        <w:rPr>
+          <w:b/>
+          <w:color w:val="0A7A2C"/>
+          <w:u w:val="single"/>
+        </w:rPr>
+        <w:t>Each owner shall be responsible for obtaining, at their own expense, insurance covering their property not insured under Section 1. In satisfaction of ORS 94.685, as amended, each owner shall obtain and maintain insurance covering, including but not limited to, the improvements and betterments to the owner's unit above the Standard Unit (as defined in the Declaration, Article I, Section 9) and the owner's responsibility for the deductible under the Association's master policy. Such owner coverage shall exclude any coverage that the owner is precluded from obtaining so as to avoid duplicate coverage. As between the Association's master policy and an owner's policy, the master policy shall be primary as to the Standard Unit and the owner's policy shall be primary as to the owner's improvements, betterments, and master-policy deductible responsibility, so that there is neither a gap nor an overlap in coverage. Each owner shall promptly inform the Board of any loss, claim or damage which may be covered under a policy maintained by the Association.</w:t>
       </w:r>
     </w:p>
     <w:p>
@@ -2406,8 +2815,6 @@
     <w:p>
       <w:pPr>
         <w:pStyle w:val="Heading2"/>
-        <w:keepNext/>
-        <w:keepLines/>
         <w:bidi w:val="0"/>
         <w:jc w:val="left"/>
         <w:rPr/>
@@ -2420,8 +2827,6 @@
     <w:p>
       <w:pPr>
         <w:pStyle w:val="Heading3"/>
-        <w:keepNext/>
-        <w:keepLines/>
         <w:bidi w:val="0"/>
         <w:jc w:val="left"/>
         <w:rPr/>
@@ -2445,8 +2850,6 @@
     <w:p>
       <w:pPr>
         <w:pStyle w:val="Heading2"/>
-        <w:keepNext/>
-        <w:keepLines/>
         <w:bidi w:val="0"/>
         <w:jc w:val="left"/>
         <w:rPr/>
@@ -2459,8 +2862,6 @@
     <w:p>
       <w:pPr>
         <w:pStyle w:val="Heading3"/>
-        <w:keepNext/>
-        <w:keepLines/>
         <w:bidi w:val="0"/>
         <w:jc w:val="left"/>
         <w:rPr/>
@@ -2474,7 +2875,7 @@
       <w:pPr>
         <w:pStyle w:val="BodyTextsection-hl"/>
         <w:bidi w:val="0"/>
-        <w:ind w:hanging="0" w:left="80" w:right="80"/>
+        <w:ind w:hanging="0" w:left="120" w:right="120"/>
         <w:rPr/>
       </w:pPr>
       <w:r>
@@ -2500,7 +2901,87 @@
       </w:r>
       <w:r>
         <w:rPr/>
-        <w:t xml:space="preserve"> These Bylaws may be amended, at a regular or special meeting of the members, by the affirmative vote of a majority of the members, as provided in ORS 94.635(16), as amended.</w:t>
+        <w:t xml:space="preserve"> These Bylaws may be amended, at a regular or special meeting of the members, by </w:t>
+      </w:r>
+      <w:r>
+        <w:rPr>
+          <w:b/>
+          <w:color w:val="0A7A2C"/>
+          <w:u w:val="single"/>
+        </w:rPr>
+        <w:t xml:space="preserve">the </w:t>
+      </w:r>
+      <w:r>
+        <w:rPr/>
+        <w:t xml:space="preserve">affirmative vote of </w:t>
+      </w:r>
+      <w:r>
+        <w:rPr>
+          <w:b/>
+          <w:color w:val="0A7A2C"/>
+          <w:u w:val="single"/>
+        </w:rPr>
+        <w:t>a</w:t>
+      </w:r>
+      <w:r>
+        <w:rPr/>
+        <w:t xml:space="preserve"> </w:t>
+      </w:r>
+      <w:r>
+        <w:rPr>
+          <w:b/>
+          <w:color w:val="0A7A2C"/>
+          <w:u w:val="single"/>
+        </w:rPr>
+        <w:t>majority</w:t>
+      </w:r>
+      <w:r>
+        <w:rPr/>
+        <w:t xml:space="preserve"> of </w:t>
+      </w:r>
+      <w:r>
+        <w:rPr>
+          <w:b/>
+          <w:color w:val="0A7A2C"/>
+          <w:u w:val="single"/>
+        </w:rPr>
+        <w:t>the</w:t>
+      </w:r>
+      <w:r>
+        <w:rPr/>
+        <w:t xml:space="preserve"> </w:t>
+      </w:r>
+      <w:r>
+        <w:rPr>
+          <w:b/>
+          <w:color w:val="0A7A2C"/>
+          <w:u w:val="single"/>
+        </w:rPr>
+        <w:t>members,</w:t>
+      </w:r>
+      <w:r>
+        <w:rPr/>
+        <w:t xml:space="preserve"> </w:t>
+      </w:r>
+      <w:r>
+        <w:rPr>
+          <w:b/>
+          <w:color w:val="0A7A2C"/>
+          <w:u w:val="single"/>
+        </w:rPr>
+        <w:t>as</w:t>
+      </w:r>
+      <w:r>
+        <w:rPr/>
+        <w:t xml:space="preserve"> </w:t>
+      </w:r>
+      <w:r>
+        <w:rPr>
+          <w:b/>
+          <w:color w:val="0A7A2C"/>
+          <w:u w:val="single"/>
+        </w:rPr>
+        <w:t>provided in ORS 94.635(16), as amended.</w:t>
       </w:r>
     </w:p>
     <w:p>
@@ -2523,8 +3004,6 @@
     <w:p>
       <w:pPr>
         <w:pStyle w:val="Heading2"/>
-        <w:keepNext/>
-        <w:keepLines/>
         <w:bidi w:val="0"/>
         <w:jc w:val="left"/>
         <w:rPr/>
@@ -2537,8 +3016,6 @@
     <w:p>
       <w:pPr>
         <w:pStyle w:val="Heading3"/>
-        <w:keepNext/>
-        <w:keepLines/>
         <w:bidi w:val="0"/>
         <w:jc w:val="left"/>
         <w:rPr/>
@@ -2552,14 +3029,23 @@
       <w:pPr>
         <w:pStyle w:val="BodyTextsection-hl"/>
         <w:bidi w:val="0"/>
-        <w:ind w:hanging="0" w:left="80" w:right="80"/>
-        <w:rPr/>
-      </w:pPr>
-      <w:r>
-        <w:rPr>
-          <w:rStyle w:val="Strong"/>
-        </w:rPr>
-        <w:t>Section 1. Fiscal Year.</w:t>
+        <w:ind w:hanging="0" w:left="120" w:right="120"/>
+        <w:rPr/>
+      </w:pPr>
+      <w:r>
+        <w:rPr>
+          <w:rStyle w:val="Strong"/>
+        </w:rPr>
+        <w:t xml:space="preserve">Section 1. </w:t>
+      </w:r>
+      <w:r>
+        <w:rPr>
+          <w:rStyle w:val="Strong"/>
+          <w:b/>
+          <w:color w:val="0A7A2C"/>
+          <w:u w:val="single"/>
+        </w:rPr>
+        <w:t>Fiscal Year.</w:t>
       </w:r>
       <w:r>
         <w:rPr/>
@@ -2578,21 +3064,38 @@
       </w:r>
       <w:r>
         <w:rPr/>
-        <w:t xml:space="preserve"> The fiscal year of the Association shall begin on the first day of January and end on the 31st day of December of every year for required public filings. Reports for the annual meeting of the Association will correspond to what can reasonably be generated prior to the annual meeting. As an example, a yearly report of August 1st to July 31st may be used for an annual meeting in September or October.</w:t>
+        <w:t xml:space="preserve"> </w:t>
+      </w:r>
+      <w:r>
+        <w:rPr>
+          <w:b/>
+          <w:color w:val="0A7A2C"/>
+          <w:u w:val="single"/>
+        </w:rPr>
+        <w:t>The fiscal year of the Association shall begin on the first day of January and end on the 31st day of December of every year for required public filings. Reports for the annual meeting of the Association will correspond to what can reasonably be generated prior to the annual meeting. As an example, a yearly report of August 1st to July 31st may be used for an annual meeting in September or October.</w:t>
       </w:r>
     </w:p>
     <w:p>
       <w:pPr>
         <w:pStyle w:val="BodyTextsection-hl"/>
         <w:bidi w:val="0"/>
-        <w:ind w:hanging="0" w:left="80" w:right="80"/>
-        <w:rPr/>
-      </w:pPr>
-      <w:r>
-        <w:rPr>
-          <w:rStyle w:val="Strong"/>
-        </w:rPr>
-        <w:t>Section 2. Statutory Compliance; Savings.</w:t>
+        <w:ind w:hanging="0" w:left="120" w:right="120"/>
+        <w:rPr/>
+      </w:pPr>
+      <w:r>
+        <w:rPr>
+          <w:rStyle w:val="Strong"/>
+        </w:rPr>
+        <w:t xml:space="preserve">Section 2. </w:t>
+      </w:r>
+      <w:r>
+        <w:rPr>
+          <w:rStyle w:val="Strong"/>
+          <w:b/>
+          <w:color w:val="0A7A2C"/>
+          <w:u w:val="single"/>
+        </w:rPr>
+        <w:t>Statutory Compliance; Savings.</w:t>
       </w:r>
       <w:r>
         <w:rPr/>
@@ -2611,13 +3114,20 @@
       </w:r>
       <w:r>
         <w:rPr/>
-        <w:t xml:space="preserve"> To the extent any provision of these Bylaws conflicts with ORS Chapter 94 or any other applicable law, the applicable law controls, and the Association shall comply with all applicable statutory requirements as amended from time to time. The invalidity or unenforceability of any provision of these Bylaws shall not affect the validity or enforceability of the remaining provisions.</w:t>
+        <w:t xml:space="preserve"> </w:t>
+      </w:r>
+      <w:r>
+        <w:rPr>
+          <w:b/>
+          <w:color w:val="0A7A2C"/>
+          <w:u w:val="single"/>
+        </w:rPr>
+        <w:t>To the extent any provision of these Bylaws conflicts with ORS Chapter 94 or any other applicable law, the applicable law controls, and the Association shall comply with all applicable statutory requirements as amended from time to time. The invalidity or unenforceability of any provision of these Bylaws shall not affect the validity or enforceability of the remaining provisions.</w:t>
       </w:r>
     </w:p>
     <w:p>
       <w:pPr>
         <w:pStyle w:val="Heading2"/>
-        <w:keepNext/>
         <w:keepLines/>
         <w:bidi w:val="0"/>
         <w:ind w:hanging="0" w:left="0" w:right="0"/>
@@ -2724,8 +3234,6 @@
     <w:p>
       <w:pPr>
         <w:pStyle w:val="Heading2"/>
-        <w:keepNext/>
-        <w:keepLines/>
         <w:bidi w:val="0"/>
         <w:ind w:hanging="0" w:left="0" w:right="0"/>
         <w:jc w:val="left"/>
@@ -3252,8 +3760,6 @@
     <w:p>
       <w:pPr>
         <w:pStyle w:val="Heading2"/>
-        <w:keepNext/>
-        <w:keepLines/>
         <w:bidi w:val="0"/>
         <w:ind w:hanging="0" w:left="0" w:right="0"/>
         <w:jc w:val="left"/>
@@ -3866,18 +4372,15 @@
       </w:r>
     </w:p>
     <w:sectPr>
-      <w:footerReference w:type="default" r:id="rId5"/>
-      <w:footerReference w:type="first" r:id="rId6"/>
-      <w:headerReference w:type="default" r:id="rId7"/>
-      <w:headerReference w:type="first" r:id="rId8"/>
+      <w:headerReference w:type="default" r:id="rId14"/>
+      <w:footerReference w:type="default" r:id="rId15"/>
       <w:type w:val="nextPage"/>
       <w:pgSz w:w="11906" w:h="16838"/>
       <w:pgMar w:left="1440" w:right="1440" w:gutter="0" w:header="0" w:top="1440" w:footer="0" w:bottom="1440"/>
-      <w:pgNumType w:fmt="decimal"/>
       <w:formProt w:val="false"/>
-      <w:titlePg/>
       <w:textDirection w:val="lrTb"/>
       <w:docGrid w:type="default" w:linePitch="600" w:charSpace="36864"/>
+      <w:pgNumType w:start="1"/>
     </w:sectPr>
   </w:body>
 </w:document>
@@ -3885,101 +4388,200 @@
 
 <file path=word/footer1.xml><?xml version="1.0" encoding="utf-8"?>
 <w:ftr xmlns:m="http://schemas.openxmlformats.org/officeDocument/2006/math" xmlns:mc="http://schemas.openxmlformats.org/markup-compatibility/2006" xmlns:mo="http://schemas.microsoft.com/office/mac/office/2008/main" xmlns:mv="urn:schemas-microsoft-com:mac:vml" xmlns:o="urn:schemas-microsoft-com:office:office" xmlns:r="http://schemas.openxmlformats.org/officeDocument/2006/relationships" xmlns:v="urn:schemas-microsoft-com:vml" xmlns:w10="urn:schemas-microsoft-com:office:word" xmlns:w14="http://schemas.microsoft.com/office/word/2010/wordml" xmlns:w="http://schemas.openxmlformats.org/wordprocessingml/2006/main" xmlns:wne="http://schemas.microsoft.com/office/word/2006/wordml" xmlns:wp14="http://schemas.microsoft.com/office/word/2010/wordprocessingDrawing" xmlns:wp="http://schemas.openxmlformats.org/drawingml/2006/wordprocessingDrawing" xmlns:wpc="http://schemas.microsoft.com/office/word/2010/wordprocessingCanvas" xmlns:wpg="http://schemas.microsoft.com/office/word/2010/wordprocessingGroup" xmlns:wpi="http://schemas.microsoft.com/office/word/2010/wordprocessingInk" xmlns:wps="http://schemas.microsoft.com/office/word/2010/wordprocessingShape" mc:Ignorable="w14 wp14">
+  <w:p/>
+</w:ftr>
+</file>
+
+<file path=word/footer2.xml><?xml version="1.0" encoding="utf-8"?>
+<w:ftr xmlns:m="http://schemas.openxmlformats.org/officeDocument/2006/math" xmlns:mc="http://schemas.openxmlformats.org/markup-compatibility/2006" xmlns:mo="http://schemas.microsoft.com/office/mac/office/2008/main" xmlns:mv="urn:schemas-microsoft-com:mac:vml" xmlns:o="urn:schemas-microsoft-com:office:office" xmlns:r="http://schemas.openxmlformats.org/officeDocument/2006/relationships" xmlns:v="urn:schemas-microsoft-com:vml" xmlns:w10="urn:schemas-microsoft-com:office:word" xmlns:w14="http://schemas.microsoft.com/office/word/2010/wordml" xmlns:w="http://schemas.openxmlformats.org/wordprocessingml/2006/main" xmlns:wne="http://schemas.microsoft.com/office/word/2006/wordml" xmlns:wp14="http://schemas.microsoft.com/office/word/2010/wordprocessingDrawing" xmlns:wp="http://schemas.openxmlformats.org/drawingml/2006/wordprocessingDrawing" xmlns:wpc="http://schemas.microsoft.com/office/word/2010/wordprocessingCanvas" xmlns:wpg="http://schemas.microsoft.com/office/word/2010/wordprocessingGroup" xmlns:wpi="http://schemas.microsoft.com/office/word/2010/wordprocessingInk" xmlns:wps="http://schemas.microsoft.com/office/word/2010/wordprocessingShape" mc:Ignorable="w14 wp14">
+  <w:p/>
+</w:ftr>
+</file>
+
+<file path=word/footer3.xml><?xml version="1.0" encoding="utf-8"?>
+<w:ftr xmlns:m="http://schemas.openxmlformats.org/officeDocument/2006/math" xmlns:mc="http://schemas.openxmlformats.org/markup-compatibility/2006" xmlns:mo="http://schemas.microsoft.com/office/mac/office/2008/main" xmlns:mv="urn:schemas-microsoft-com:mac:vml" xmlns:o="urn:schemas-microsoft-com:office:office" xmlns:r="http://schemas.openxmlformats.org/officeDocument/2006/relationships" xmlns:v="urn:schemas-microsoft-com:vml" xmlns:w10="urn:schemas-microsoft-com:office:word" xmlns:w14="http://schemas.microsoft.com/office/word/2010/wordml" xmlns:w="http://schemas.openxmlformats.org/wordprocessingml/2006/main" xmlns:wne="http://schemas.microsoft.com/office/word/2006/wordml" xmlns:wp14="http://schemas.microsoft.com/office/word/2010/wordprocessingDrawing" xmlns:wp="http://schemas.openxmlformats.org/drawingml/2006/wordprocessingDrawing" xmlns:wpc="http://schemas.microsoft.com/office/word/2010/wordprocessingCanvas" xmlns:wpg="http://schemas.microsoft.com/office/word/2010/wordprocessingGroup" xmlns:wpi="http://schemas.microsoft.com/office/word/2010/wordprocessingInk" xmlns:wps="http://schemas.microsoft.com/office/word/2010/wordprocessingShape" mc:Ignorable="w14 wp14">
   <w:p>
     <w:pPr>
-      <w:pStyle w:val="Footer"/>
+      <w:jc w:val="left"/>
+    </w:pPr>
+    <w:r>
+      <w:rPr>
+        <w:b w:val="0"/>
+        <w:color w:val="404040"/>
+        <w:sz w:val="15"/>
+      </w:rPr>
+      <w:t>AHOA-Bylaws-CLEAN-Amended_v2026-08-20A.docx</w:t>
+    </w:r>
+  </w:p>
+</w:ftr>
+</file>
+
+<file path=word/footer4.xml><?xml version="1.0" encoding="utf-8"?>
+<w:ftr xmlns:m="http://schemas.openxmlformats.org/officeDocument/2006/math" xmlns:mc="http://schemas.openxmlformats.org/markup-compatibility/2006" xmlns:mo="http://schemas.microsoft.com/office/mac/office/2008/main" xmlns:mv="urn:schemas-microsoft-com:mac:vml" xmlns:o="urn:schemas-microsoft-com:office:office" xmlns:r="http://schemas.openxmlformats.org/officeDocument/2006/relationships" xmlns:v="urn:schemas-microsoft-com:vml" xmlns:w10="urn:schemas-microsoft-com:office:word" xmlns:w14="http://schemas.microsoft.com/office/word/2010/wordml" xmlns:w="http://schemas.openxmlformats.org/wordprocessingml/2006/main" xmlns:wne="http://schemas.microsoft.com/office/word/2006/wordml" xmlns:wp14="http://schemas.microsoft.com/office/word/2010/wordprocessingDrawing" xmlns:wp="http://schemas.openxmlformats.org/drawingml/2006/wordprocessingDrawing" xmlns:wpc="http://schemas.microsoft.com/office/word/2010/wordprocessingCanvas" xmlns:wpg="http://schemas.microsoft.com/office/word/2010/wordprocessingGroup" xmlns:wpi="http://schemas.microsoft.com/office/word/2010/wordprocessingInk" xmlns:wps="http://schemas.microsoft.com/office/word/2010/wordprocessingShape" mc:Ignorable="w14 wp14">
+  <w:p>
+    <w:pPr>
+      <w:jc w:val="left"/>
+    </w:pPr>
+    <w:r>
+      <w:rPr>
+        <w:b w:val="0"/>
+        <w:color w:val="404040"/>
+        <w:sz w:val="15"/>
+      </w:rPr>
+      <w:t>AHOA-Bylaws-CLEAN-Amended_v2026-08-20A.docx</w:t>
+    </w:r>
+  </w:p>
+</w:ftr>
+</file>
+
+<file path=word/footer5.xml><?xml version="1.0" encoding="utf-8"?>
+<w:ftr xmlns:m="http://schemas.openxmlformats.org/officeDocument/2006/math" xmlns:mc="http://schemas.openxmlformats.org/markup-compatibility/2006" xmlns:mo="http://schemas.microsoft.com/office/mac/office/2008/main" xmlns:mv="urn:schemas-microsoft-com:mac:vml" xmlns:o="urn:schemas-microsoft-com:office:office" xmlns:r="http://schemas.openxmlformats.org/officeDocument/2006/relationships" xmlns:v="urn:schemas-microsoft-com:vml" xmlns:w10="urn:schemas-microsoft-com:office:word" xmlns:w14="http://schemas.microsoft.com/office/word/2010/wordml" xmlns:w="http://schemas.openxmlformats.org/wordprocessingml/2006/main" xmlns:wne="http://schemas.microsoft.com/office/word/2006/wordml" xmlns:wp14="http://schemas.microsoft.com/office/word/2010/wordprocessingDrawing" xmlns:wp="http://schemas.openxmlformats.org/drawingml/2006/wordprocessingDrawing" xmlns:wpc="http://schemas.microsoft.com/office/word/2010/wordprocessingCanvas" xmlns:wpg="http://schemas.microsoft.com/office/word/2010/wordprocessingGroup" xmlns:wpi="http://schemas.microsoft.com/office/word/2010/wordprocessingInk" xmlns:wps="http://schemas.microsoft.com/office/word/2010/wordprocessingShape" mc:Ignorable="w14 wp14">
+  <w:p>
+    <w:pPr>
       <w:tabs>
+        <w:tab w:pos="4513" w:val="center"/>
         <w:tab w:pos="9026" w:val="right"/>
       </w:tabs>
     </w:pPr>
     <w:r/>
     <w:r>
+      <w:rPr>
+        <w:b w:val="0"/>
+        <w:color w:val="404040"/>
+        <w:sz w:val="15"/>
+      </w:rPr>
       <w:t>AHOA-Bylaws-CLEAN-Amended_v2026-08-20A.docx</w:t>
     </w:r>
     <w:r>
       <w:tab/>
     </w:r>
     <w:r>
-      <w:t xml:space="preserve">Page </w:t>
-    </w:r>
-    <w:r>
-      <w:fldChar w:fldCharType="begin"/>
-      <w:instrText xml:space="preserve">PAGE</w:instrText>
-      <w:fldChar w:fldCharType="end"/>
-    </w:r>
-    <w:r>
-      <w:t xml:space="preserve"> of </w:t>
-    </w:r>
-    <w:r>
-      <w:fldChar w:fldCharType="begin"/>
-      <w:instrText xml:space="preserve">NUMPAGES</w:instrText>
-      <w:fldChar w:fldCharType="end"/>
-    </w:r>
-  </w:p>
-</w:ftr>
-</file>
-
-<file path=word/footer2.xml><?xml version="1.0" encoding="utf-8"?>
-<w:ftr xmlns:m="http://schemas.openxmlformats.org/officeDocument/2006/math" xmlns:mc="http://schemas.openxmlformats.org/markup-compatibility/2006" xmlns:mo="http://schemas.microsoft.com/office/mac/office/2008/main" xmlns:mv="urn:schemas-microsoft-com:mac:vml" xmlns:o="urn:schemas-microsoft-com:office:office" xmlns:r="http://schemas.openxmlformats.org/officeDocument/2006/relationships" xmlns:v="urn:schemas-microsoft-com:vml" xmlns:w10="urn:schemas-microsoft-com:office:word" xmlns:w14="http://schemas.microsoft.com/office/word/2010/wordml" xmlns:w="http://schemas.openxmlformats.org/wordprocessingml/2006/main" xmlns:wne="http://schemas.microsoft.com/office/word/2006/wordml" xmlns:wp14="http://schemas.microsoft.com/office/word/2010/wordprocessingDrawing" xmlns:wp="http://schemas.openxmlformats.org/drawingml/2006/wordprocessingDrawing" xmlns:wpc="http://schemas.microsoft.com/office/word/2010/wordprocessingCanvas" xmlns:wpg="http://schemas.microsoft.com/office/word/2010/wordprocessingGroup" xmlns:wpi="http://schemas.microsoft.com/office/word/2010/wordprocessingInk" xmlns:wps="http://schemas.microsoft.com/office/word/2010/wordprocessingShape" mc:Ignorable="w14 wp14">
-  <w:p>
-    <w:pPr>
-      <w:pStyle w:val="Footer"/>
-      <w:tabs>
-        <w:tab w:pos="9026" w:val="right"/>
-      </w:tabs>
-    </w:pPr>
-    <w:r/>
-    <w:r>
-      <w:t>AHOA-Bylaws-CLEAN-Amended_v2026-08-20A.docx</w:t>
+      <w:rPr>
+        <w:b w:val="0"/>
+        <w:color w:val="B3261E"/>
+        <w:sz w:val="15"/>
+      </w:rPr>
+      <w:t>DRAFT · FOR ATTORNEY REVIEW</w:t>
     </w:r>
     <w:r>
       <w:tab/>
     </w:r>
     <w:r>
+      <w:rPr>
+        <w:b w:val="0"/>
+        <w:color w:val="404040"/>
+        <w:sz w:val="15"/>
+      </w:rPr>
       <w:t xml:space="preserve">Page </w:t>
     </w:r>
+    <w:fldSimple w:instr=" PAGE ">
+      <w:r>
+        <w:rPr>
+          <w:sz w:val="15.0"/>
+          <w:color w:val="404040"/>
+        </w:rPr>
+        <w:t>1</w:t>
+      </w:r>
+    </w:fldSimple>
     <w:r>
-      <w:fldChar w:fldCharType="begin"/>
-      <w:instrText xml:space="preserve">PAGE</w:instrText>
-      <w:fldChar w:fldCharType="end"/>
-    </w:r>
-    <w:r>
+      <w:rPr>
+        <w:b w:val="0"/>
+        <w:color w:val="404040"/>
+        <w:sz w:val="15"/>
+      </w:rPr>
       <w:t xml:space="preserve"> of </w:t>
     </w:r>
-    <w:r>
-      <w:fldChar w:fldCharType="begin"/>
-      <w:instrText xml:space="preserve">NUMPAGES</w:instrText>
-      <w:fldChar w:fldCharType="end"/>
-    </w:r>
+    <w:fldSimple w:instr=" SECTIONPAGES ">
+      <w:r>
+        <w:rPr>
+          <w:sz w:val="15.0"/>
+          <w:color w:val="404040"/>
+        </w:rPr>
+        <w:t>1</w:t>
+      </w:r>
+    </w:fldSimple>
   </w:p>
 </w:ftr>
 </file>
 
 <file path=word/header1.xml><?xml version="1.0" encoding="utf-8"?>
 <w:hdr xmlns:m="http://schemas.openxmlformats.org/officeDocument/2006/math" xmlns:mc="http://schemas.openxmlformats.org/markup-compatibility/2006" xmlns:mo="http://schemas.microsoft.com/office/mac/office/2008/main" xmlns:mv="urn:schemas-microsoft-com:mac:vml" xmlns:o="urn:schemas-microsoft-com:office:office" xmlns:r="http://schemas.openxmlformats.org/officeDocument/2006/relationships" xmlns:v="urn:schemas-microsoft-com:vml" xmlns:w10="urn:schemas-microsoft-com:office:word" xmlns:w14="http://schemas.microsoft.com/office/word/2010/wordml" xmlns:w="http://schemas.openxmlformats.org/wordprocessingml/2006/main" xmlns:wne="http://schemas.microsoft.com/office/word/2006/wordml" xmlns:wp14="http://schemas.microsoft.com/office/word/2010/wordprocessingDrawing" xmlns:wp="http://schemas.openxmlformats.org/drawingml/2006/wordprocessingDrawing" xmlns:wpc="http://schemas.microsoft.com/office/word/2010/wordprocessingCanvas" xmlns:wpg="http://schemas.microsoft.com/office/word/2010/wordprocessingGroup" xmlns:wpi="http://schemas.microsoft.com/office/word/2010/wordprocessingInk" xmlns:wps="http://schemas.microsoft.com/office/word/2010/wordprocessingShape" mc:Ignorable="w14 wp14">
+  <w:p/>
+</w:hdr>
+</file>
+
+<file path=word/header2.xml><?xml version="1.0" encoding="utf-8"?>
+<w:hdr xmlns:m="http://schemas.openxmlformats.org/officeDocument/2006/math" xmlns:mc="http://schemas.openxmlformats.org/markup-compatibility/2006" xmlns:mo="http://schemas.microsoft.com/office/mac/office/2008/main" xmlns:mv="urn:schemas-microsoft-com:mac:vml" xmlns:o="urn:schemas-microsoft-com:office:office" xmlns:r="http://schemas.openxmlformats.org/officeDocument/2006/relationships" xmlns:v="urn:schemas-microsoft-com:vml" xmlns:w10="urn:schemas-microsoft-com:office:word" xmlns:w14="http://schemas.microsoft.com/office/word/2010/wordml" xmlns:w="http://schemas.openxmlformats.org/wordprocessingml/2006/main" xmlns:wne="http://schemas.microsoft.com/office/word/2006/wordml" xmlns:wp14="http://schemas.microsoft.com/office/word/2010/wordprocessingDrawing" xmlns:wp="http://schemas.openxmlformats.org/drawingml/2006/wordprocessingDrawing" xmlns:wpc="http://schemas.microsoft.com/office/word/2010/wordprocessingCanvas" xmlns:wpg="http://schemas.microsoft.com/office/word/2010/wordprocessingGroup" xmlns:wpi="http://schemas.microsoft.com/office/word/2010/wordprocessingInk" xmlns:wps="http://schemas.microsoft.com/office/word/2010/wordprocessingShape" mc:Ignorable="w14 wp14">
+  <w:p/>
+</w:hdr>
+</file>
+
+<file path=word/header3.xml><?xml version="1.0" encoding="utf-8"?>
+<w:hdr xmlns:m="http://schemas.openxmlformats.org/officeDocument/2006/math" xmlns:mc="http://schemas.openxmlformats.org/markup-compatibility/2006" xmlns:mo="http://schemas.microsoft.com/office/mac/office/2008/main" xmlns:mv="urn:schemas-microsoft-com:mac:vml" xmlns:o="urn:schemas-microsoft-com:office:office" xmlns:r="http://schemas.openxmlformats.org/officeDocument/2006/relationships" xmlns:v="urn:schemas-microsoft-com:vml" xmlns:w10="urn:schemas-microsoft-com:office:word" xmlns:w14="http://schemas.microsoft.com/office/word/2010/wordml" xmlns:w="http://schemas.openxmlformats.org/wordprocessingml/2006/main" xmlns:wne="http://schemas.microsoft.com/office/word/2006/wordml" xmlns:wp14="http://schemas.microsoft.com/office/word/2010/wordprocessingDrawing" xmlns:wp="http://schemas.openxmlformats.org/drawingml/2006/wordprocessingDrawing" xmlns:wpc="http://schemas.microsoft.com/office/word/2010/wordprocessingCanvas" xmlns:wpg="http://schemas.microsoft.com/office/word/2010/wordprocessingGroup" xmlns:wpi="http://schemas.microsoft.com/office/word/2010/wordprocessingInk" xmlns:wps="http://schemas.microsoft.com/office/word/2010/wordprocessingShape" mc:Ignorable="w14 wp14">
   <w:p>
     <w:pPr>
-      <w:pStyle w:val="Header"/>
+      <w:jc w:val="center"/>
     </w:pPr>
-    <w:r/>
     <w:r>
       <w:rPr>
         <w:b/>
         <w:sz w:val="26"/>
       </w:rPr>
-      <w:t>Armadale Bylaws — Second Amendment (Restated) — CLEAN</w:t>
+      <w:t>AHOA Bylaws — Proposed Changes</w:t>
     </w:r>
   </w:p>
 </w:hdr>
 </file>
 
-<file path=word/header2.xml><?xml version="1.0" encoding="utf-8"?>
+<file path=word/header4.xml><?xml version="1.0" encoding="utf-8"?>
+<w:hdr xmlns:m="http://schemas.openxmlformats.org/officeDocument/2006/math" xmlns:mc="http://schemas.openxmlformats.org/markup-compatibility/2006" xmlns:mo="http://schemas.microsoft.com/office/mac/office/2008/main" xmlns:mv="urn:schemas-microsoft-com:mac:vml" xmlns:o="urn:schemas-microsoft-com:office:office" xmlns:r="http://schemas.openxmlformats.org/officeDocument/2006/relationships" xmlns:v="urn:schemas-microsoft-com:vml" xmlns:w10="urn:schemas-microsoft-com:office:word" xmlns:w14="http://schemas.microsoft.com/office/word/2010/wordml" xmlns:w="http://schemas.openxmlformats.org/wordprocessingml/2006/main" xmlns:wne="http://schemas.microsoft.com/office/word/2006/wordml" xmlns:wp14="http://schemas.microsoft.com/office/word/2010/wordprocessingDrawing" xmlns:wp="http://schemas.openxmlformats.org/drawingml/2006/wordprocessingDrawing" xmlns:wpc="http://schemas.microsoft.com/office/word/2010/wordprocessingCanvas" xmlns:wpg="http://schemas.microsoft.com/office/word/2010/wordprocessingGroup" xmlns:wpi="http://schemas.microsoft.com/office/word/2010/wordprocessingInk" xmlns:wps="http://schemas.microsoft.com/office/word/2010/wordprocessingShape" mc:Ignorable="w14 wp14">
+  <w:p/>
+</w:hdr>
+</file>
+
+<file path=word/header5.xml><?xml version="1.0" encoding="utf-8"?>
 <w:hdr xmlns:m="http://schemas.openxmlformats.org/officeDocument/2006/math" xmlns:mc="http://schemas.openxmlformats.org/markup-compatibility/2006" xmlns:mo="http://schemas.microsoft.com/office/mac/office/2008/main" xmlns:mv="urn:schemas-microsoft-com:mac:vml" xmlns:o="urn:schemas-microsoft-com:office:office" xmlns:r="http://schemas.openxmlformats.org/officeDocument/2006/relationships" xmlns:v="urn:schemas-microsoft-com:vml" xmlns:w10="urn:schemas-microsoft-com:office:word" xmlns:w14="http://schemas.microsoft.com/office/word/2010/wordml" xmlns:w="http://schemas.openxmlformats.org/wordprocessingml/2006/main" xmlns:wne="http://schemas.microsoft.com/office/word/2006/wordml" xmlns:wp14="http://schemas.microsoft.com/office/word/2010/wordprocessingDrawing" xmlns:wp="http://schemas.openxmlformats.org/drawingml/2006/wordprocessingDrawing" xmlns:wpc="http://schemas.microsoft.com/office/word/2010/wordprocessingCanvas" xmlns:wpg="http://schemas.microsoft.com/office/word/2010/wordprocessingGroup" xmlns:wpi="http://schemas.microsoft.com/office/word/2010/wordprocessingInk" xmlns:wps="http://schemas.microsoft.com/office/word/2010/wordprocessingShape" mc:Ignorable="w14 wp14">
   <w:p>
     <w:pPr>
-      <w:pStyle w:val="Header"/>
+      <w:jc w:val="left"/>
     </w:pPr>
     <w:r/>
+    <w:hyperlink w:anchor="ChangeIndex">
+      <w:r>
+        <w:rPr>
+          <w:color w:val="0B447C"/>
+          <w:u w:val="single"/>
+          <w:sz w:val="16"/>
+        </w:rPr>
+        <w:t>Return to Change Index</w:t>
+      </w:r>
+    </w:hyperlink>
+  </w:p>
+  <w:p>
+    <w:pPr>
+      <w:jc w:val="center"/>
+    </w:pPr>
+    <w:r>
+      <w:rPr>
+        <w:b/>
+        <w:color w:val="404040"/>
+        <w:sz w:val="16"/>
+      </w:rPr>
+      <w:t>Armadale Townhomes Owners Association</w:t>
+    </w:r>
+  </w:p>
+  <w:p>
+    <w:pPr>
+      <w:jc w:val="center"/>
+    </w:pPr>
+    <w:r>
+      <w:rPr>
+        <w:b/>
+        <w:color w:val="404040"/>
+        <w:sz w:val="16"/>
+      </w:rPr>
+      <w:t>Bylaws — Second Amendment (Restated)</w:t>
+    </w:r>
   </w:p>
 </w:hdr>
 </file>

</xml_diff>